<commit_message>
feat!: 2026 brand is the default; Chrome downloads on first use
- No --brand / frontmatter brand now means 2026; -b classic (or
  brand: classic) keeps the old brand for the transition.
- Recent npm skips install scripts, so puppeteer never fetched Chrome:
  cognizone-convert now runs puppeteer's install on first PDF/DOCX use.
- PDF/HTML contents page: gap before the next chapter after sub-entries.
- 2026 PDF renderer spawns process.execPath instead of 'node'.
- Docs: cross-platform install, fonts per OS, troubleshooting, Claude
  Code note; README samples and screenshots now show the 2026 brand.

Co-Authored-By: Claude Opus 5.5 <noreply@anthropic.com>
</commit_message>
<xml_diff>
--- a/test/output/fixture.docx
+++ b/test/output/fixture.docx
@@ -57,7 +57,7 @@
         </w:rPr>
         <w:t xml:space="preserve">	</w:t>
       </w:r>
-      <w:hyperlink w:history="1" r:id="rIdbnijrryz78m1xpdfawh_2">
+      <w:hyperlink w:history="1" r:id="rIdoo1vwyw6ztdol_c06xjlr">
         <w:r>
           <w:rPr>
             <w:rFonts w:ascii="Roboto" w:cs="Roboto" w:eastAsia="Roboto" w:hAnsi="Roboto"/>
@@ -74,7 +74,7 @@
         <w:spacing w:after="400"/>
         <w:jc w:val="right"/>
       </w:pPr>
-      <w:hyperlink w:history="1" r:id="rIdx7vb6xy0scpi1wm44cyaj">
+      <w:hyperlink w:history="1" r:id="rIdzgyllx96ctae_n434tl-p">
         <w:r>
           <w:rPr>
             <w:rFonts w:ascii="Roboto" w:cs="Roboto" w:eastAsia="Roboto" w:hAnsi="Roboto"/>
@@ -848,6 +848,7 @@
           <w:bCs/>
           <w:i w:val="false"/>
           <w:iCs w:val="false"/>
+          <w:strike w:val="false"/>
           <w:color w:val="353744"/>
           <w:sz w:val="26"/>
           <w:szCs w:val="26"/>
@@ -866,6 +867,7 @@
           <w:bCs w:val="false"/>
           <w:i w:val="false"/>
           <w:iCs w:val="false"/>
+          <w:strike w:val="false"/>
           <w:color w:val="353744"/>
           <w:sz w:val="20"/>
           <w:szCs w:val="20"/>
@@ -901,6 +903,7 @@
           <w:bCs/>
           <w:i w:val="false"/>
           <w:iCs w:val="false"/>
+          <w:strike w:val="false"/>
           <w:color w:val="353744"/>
           <w:sz w:val="26"/>
           <w:szCs w:val="26"/>
@@ -919,6 +922,7 @@
           <w:bCs w:val="false"/>
           <w:i w:val="false"/>
           <w:iCs w:val="false"/>
+          <w:strike w:val="false"/>
           <w:color w:val="353744"/>
           <w:sz w:val="20"/>
           <w:szCs w:val="20"/>
@@ -932,6 +936,7 @@
           <w:bCs/>
           <w:i w:val="false"/>
           <w:iCs w:val="false"/>
+          <w:strike w:val="false"/>
           <w:color w:val="353744"/>
           <w:sz w:val="20"/>
           <w:szCs w:val="20"/>
@@ -945,6 +950,7 @@
           <w:bCs w:val="false"/>
           <w:i w:val="false"/>
           <w:iCs w:val="false"/>
+          <w:strike w:val="false"/>
           <w:color w:val="353744"/>
           <w:sz w:val="20"/>
           <w:szCs w:val="20"/>
@@ -958,6 +964,7 @@
           <w:bCs w:val="false"/>
           <w:i/>
           <w:iCs/>
+          <w:strike w:val="false"/>
           <w:color w:val="353744"/>
           <w:sz w:val="20"/>
           <w:szCs w:val="20"/>
@@ -971,6 +978,7 @@
           <w:bCs w:val="false"/>
           <w:i w:val="false"/>
           <w:iCs w:val="false"/>
+          <w:strike w:val="false"/>
           <w:color w:val="353744"/>
           <w:sz w:val="20"/>
           <w:szCs w:val="20"/>
@@ -984,6 +992,7 @@
           <w:bCs/>
           <w:i/>
           <w:iCs/>
+          <w:strike w:val="false"/>
           <w:color w:val="353744"/>
           <w:sz w:val="20"/>
           <w:szCs w:val="20"/>
@@ -997,6 +1006,7 @@
           <w:bCs w:val="false"/>
           <w:i w:val="false"/>
           <w:iCs w:val="false"/>
+          <w:strike w:val="false"/>
           <w:color w:val="353744"/>
           <w:sz w:val="20"/>
           <w:szCs w:val="20"/>
@@ -1010,6 +1020,7 @@
           <w:bCs w:val="false"/>
           <w:i w:val="false"/>
           <w:iCs w:val="false"/>
+          <w:strike w:val="false"/>
           <w:color w:val="188038"/>
           <w:sz w:val="18"/>
           <w:szCs w:val="18"/>
@@ -1024,13 +1035,14 @@
           <w:bCs w:val="false"/>
           <w:i w:val="false"/>
           <w:iCs w:val="false"/>
+          <w:strike w:val="false"/>
           <w:color w:val="353744"/>
           <w:sz w:val="20"/>
           <w:szCs w:val="20"/>
         </w:rPr>
         <w:t xml:space="preserve"> and a </w:t>
       </w:r>
-      <w:hyperlink w:history="1" r:id="rIdkizexuwhklg1gv2siekhq">
+      <w:hyperlink w:history="1" r:id="rIdofv18gmqbq5usi_w6kcui">
         <w:r>
           <w:rPr>
             <w:rFonts w:ascii="Roboto" w:cs="Roboto" w:eastAsia="Roboto" w:hAnsi="Roboto"/>
@@ -1038,6 +1050,7 @@
             <w:bCs w:val="false"/>
             <w:i w:val="false"/>
             <w:iCs w:val="false"/>
+            <w:strike w:val="false"/>
             <w:color w:val="058775"/>
             <w:sz w:val="20"/>
             <w:szCs w:val="20"/>
@@ -1052,6 +1065,7 @@
           <w:bCs w:val="false"/>
           <w:i w:val="false"/>
           <w:iCs w:val="false"/>
+          <w:strike w:val="false"/>
           <w:color w:val="353744"/>
           <w:sz w:val="20"/>
           <w:szCs w:val="20"/>
@@ -1070,6 +1084,7 @@
           <w:bCs w:val="false"/>
           <w:i w:val="false"/>
           <w:iCs w:val="false"/>
+          <w:strike w:val="false"/>
           <w:color w:val="353744"/>
           <w:sz w:val="20"/>
           <w:szCs w:val="20"/>
@@ -1083,6 +1098,7 @@
           <w:bCs w:val="false"/>
           <w:i w:val="false"/>
           <w:iCs w:val="false"/>
+          <w:strike w:val="false"/>
           <w:color w:val="188038"/>
           <w:sz w:val="18"/>
           <w:szCs w:val="18"/>
@@ -1097,6 +1113,7 @@
           <w:bCs w:val="false"/>
           <w:i w:val="false"/>
           <w:iCs w:val="false"/>
+          <w:strike w:val="false"/>
           <w:color w:val="353744"/>
           <w:sz w:val="20"/>
           <w:szCs w:val="20"/>
@@ -1132,6 +1149,7 @@
           <w:bCs/>
           <w:i w:val="false"/>
           <w:iCs w:val="false"/>
+          <w:strike w:val="false"/>
           <w:color w:val="353744"/>
           <w:sz w:val="26"/>
           <w:szCs w:val="26"/>
@@ -1150,6 +1168,7 @@
           <w:bCs w:val="false"/>
           <w:i w:val="false"/>
           <w:iCs w:val="false"/>
+          <w:strike w:val="false"/>
           <w:color w:val="353744"/>
           <w:sz w:val="20"/>
           <w:szCs w:val="20"/>
@@ -1314,6 +1333,7 @@
           <w:bCs w:val="false"/>
           <w:i w:val="false"/>
           <w:iCs w:val="false"/>
+          <w:strike w:val="false"/>
           <w:color w:val="353744"/>
           <w:sz w:val="20"/>
           <w:szCs w:val="20"/>
@@ -1408,6 +1428,7 @@
           <w:bCs w:val="false"/>
           <w:i w:val="false"/>
           <w:iCs w:val="false"/>
+          <w:strike w:val="false"/>
           <w:color w:val="353744"/>
           <w:sz w:val="20"/>
           <w:szCs w:val="20"/>
@@ -1488,6 +1509,7 @@
           <w:bCs w:val="false"/>
           <w:i w:val="false"/>
           <w:iCs w:val="false"/>
+          <w:strike w:val="false"/>
           <w:color w:val="353744"/>
           <w:sz w:val="20"/>
           <w:szCs w:val="20"/>
@@ -1501,6 +1523,7 @@
           <w:bCs w:val="false"/>
           <w:i w:val="false"/>
           <w:iCs w:val="false"/>
+          <w:strike w:val="false"/>
           <w:color w:val="188038"/>
           <w:sz w:val="18"/>
           <w:szCs w:val="18"/>
@@ -1515,6 +1538,7 @@
           <w:bCs w:val="false"/>
           <w:i w:val="false"/>
           <w:iCs w:val="false"/>
+          <w:strike w:val="false"/>
           <w:color w:val="353744"/>
           <w:sz w:val="20"/>
           <w:szCs w:val="20"/>
@@ -1528,6 +1552,7 @@
           <w:bCs w:val="false"/>
           <w:i w:val="false"/>
           <w:iCs w:val="false"/>
+          <w:strike w:val="false"/>
           <w:color w:val="188038"/>
           <w:sz w:val="18"/>
           <w:szCs w:val="18"/>
@@ -1542,6 +1567,7 @@
           <w:bCs w:val="false"/>
           <w:i w:val="false"/>
           <w:iCs w:val="false"/>
+          <w:strike w:val="false"/>
           <w:color w:val="353744"/>
           <w:sz w:val="20"/>
           <w:szCs w:val="20"/>
@@ -1577,6 +1603,7 @@
           <w:bCs/>
           <w:i w:val="false"/>
           <w:iCs w:val="false"/>
+          <w:strike w:val="false"/>
           <w:color w:val="353744"/>
           <w:sz w:val="26"/>
           <w:szCs w:val="26"/>
@@ -1609,6 +1636,7 @@
           <w:bCs/>
           <w:i w:val="false"/>
           <w:iCs w:val="false"/>
+          <w:strike w:val="false"/>
           <w:color w:val="058775"/>
           <w:sz w:val="24"/>
           <w:szCs w:val="24"/>
@@ -1658,6 +1686,7 @@
                 <w:bCs/>
                 <w:i w:val="false"/>
                 <w:iCs w:val="false"/>
+                <w:strike w:val="false"/>
                 <w:color w:val="FFFFFF"/>
                 <w:sz w:val="19"/>
                 <w:szCs w:val="19"/>
@@ -1687,6 +1716,7 @@
                 <w:bCs/>
                 <w:i w:val="false"/>
                 <w:iCs w:val="false"/>
+                <w:strike w:val="false"/>
                 <w:color w:val="FFFFFF"/>
                 <w:sz w:val="19"/>
                 <w:szCs w:val="19"/>
@@ -1716,6 +1746,7 @@
                 <w:bCs/>
                 <w:i w:val="false"/>
                 <w:iCs w:val="false"/>
+                <w:strike w:val="false"/>
                 <w:color w:val="FFFFFF"/>
                 <w:sz w:val="19"/>
                 <w:szCs w:val="19"/>
@@ -1747,6 +1778,7 @@
                 <w:bCs w:val="false"/>
                 <w:i w:val="false"/>
                 <w:iCs w:val="false"/>
+                <w:strike w:val="false"/>
                 <w:color w:val="353744"/>
                 <w:sz w:val="20"/>
                 <w:szCs w:val="20"/>
@@ -1776,6 +1808,7 @@
                 <w:bCs w:val="false"/>
                 <w:i w:val="false"/>
                 <w:iCs w:val="false"/>
+                <w:strike w:val="false"/>
                 <w:color w:val="353744"/>
                 <w:sz w:val="20"/>
                 <w:szCs w:val="20"/>
@@ -1805,6 +1838,7 @@
                 <w:bCs w:val="false"/>
                 <w:i w:val="false"/>
                 <w:iCs w:val="false"/>
+                <w:strike w:val="false"/>
                 <w:color w:val="353744"/>
                 <w:sz w:val="20"/>
                 <w:szCs w:val="20"/>
@@ -1836,6 +1870,7 @@
                 <w:bCs w:val="false"/>
                 <w:i w:val="false"/>
                 <w:iCs w:val="false"/>
+                <w:strike w:val="false"/>
                 <w:color w:val="353744"/>
                 <w:sz w:val="20"/>
                 <w:szCs w:val="20"/>
@@ -1865,6 +1900,7 @@
                 <w:bCs w:val="false"/>
                 <w:i w:val="false"/>
                 <w:iCs w:val="false"/>
+                <w:strike w:val="false"/>
                 <w:color w:val="353744"/>
                 <w:sz w:val="20"/>
                 <w:szCs w:val="20"/>
@@ -1894,6 +1930,7 @@
                 <w:bCs w:val="false"/>
                 <w:i w:val="false"/>
                 <w:iCs w:val="false"/>
+                <w:strike w:val="false"/>
                 <w:color w:val="353744"/>
                 <w:sz w:val="20"/>
                 <w:szCs w:val="20"/>
@@ -1925,6 +1962,7 @@
                 <w:bCs w:val="false"/>
                 <w:i w:val="false"/>
                 <w:iCs w:val="false"/>
+                <w:strike w:val="false"/>
                 <w:color w:val="353744"/>
                 <w:sz w:val="20"/>
                 <w:szCs w:val="20"/>
@@ -1954,6 +1992,7 @@
                 <w:bCs w:val="false"/>
                 <w:i w:val="false"/>
                 <w:iCs w:val="false"/>
+                <w:strike w:val="false"/>
                 <w:color w:val="353744"/>
                 <w:sz w:val="20"/>
                 <w:szCs w:val="20"/>
@@ -1983,6 +2022,7 @@
                 <w:bCs w:val="false"/>
                 <w:i w:val="false"/>
                 <w:iCs w:val="false"/>
+                <w:strike w:val="false"/>
                 <w:color w:val="353744"/>
                 <w:sz w:val="20"/>
                 <w:szCs w:val="20"/>
@@ -2014,6 +2054,7 @@
                 <w:bCs w:val="false"/>
                 <w:i w:val="false"/>
                 <w:iCs w:val="false"/>
+                <w:strike w:val="false"/>
                 <w:color w:val="353744"/>
                 <w:sz w:val="20"/>
                 <w:szCs w:val="20"/>
@@ -2043,6 +2084,7 @@
                 <w:bCs w:val="false"/>
                 <w:i w:val="false"/>
                 <w:iCs w:val="false"/>
+                <w:strike w:val="false"/>
                 <w:color w:val="353744"/>
                 <w:sz w:val="20"/>
                 <w:szCs w:val="20"/>
@@ -2072,6 +2114,7 @@
                 <w:bCs w:val="false"/>
                 <w:i w:val="false"/>
                 <w:iCs w:val="false"/>
+                <w:strike w:val="false"/>
                 <w:color w:val="353744"/>
                 <w:sz w:val="20"/>
                 <w:szCs w:val="20"/>
@@ -2103,6 +2146,7 @@
                 <w:bCs w:val="false"/>
                 <w:i w:val="false"/>
                 <w:iCs w:val="false"/>
+                <w:strike w:val="false"/>
                 <w:color w:val="353744"/>
                 <w:sz w:val="20"/>
                 <w:szCs w:val="20"/>
@@ -2132,6 +2176,7 @@
                 <w:bCs w:val="false"/>
                 <w:i w:val="false"/>
                 <w:iCs w:val="false"/>
+                <w:strike w:val="false"/>
                 <w:color w:val="353744"/>
                 <w:sz w:val="20"/>
                 <w:szCs w:val="20"/>
@@ -2161,6 +2206,7 @@
                 <w:bCs w:val="false"/>
                 <w:i w:val="false"/>
                 <w:iCs w:val="false"/>
+                <w:strike w:val="false"/>
                 <w:color w:val="353744"/>
                 <w:sz w:val="20"/>
                 <w:szCs w:val="20"/>
@@ -2201,6 +2247,7 @@
           <w:bCs/>
           <w:i w:val="false"/>
           <w:iCs w:val="false"/>
+          <w:strike w:val="false"/>
           <w:color w:val="058775"/>
           <w:sz w:val="24"/>
           <w:szCs w:val="24"/>
@@ -2250,6 +2297,7 @@
                 <w:bCs/>
                 <w:i w:val="false"/>
                 <w:iCs w:val="false"/>
+                <w:strike w:val="false"/>
                 <w:color w:val="FFFFFF"/>
                 <w:sz w:val="19"/>
                 <w:szCs w:val="19"/>
@@ -2271,6 +2319,7 @@
           <w:p>
             <w:pPr>
               <w:spacing w:after="40" w:before="40"/>
+              <w:jc w:val="center"/>
             </w:pPr>
             <w:r>
               <w:rPr>
@@ -2279,6 +2328,7 @@
                 <w:bCs/>
                 <w:i w:val="false"/>
                 <w:iCs w:val="false"/>
+                <w:strike w:val="false"/>
                 <w:color w:val="FFFFFF"/>
                 <w:sz w:val="19"/>
                 <w:szCs w:val="19"/>
@@ -2308,6 +2358,7 @@
                 <w:bCs/>
                 <w:i w:val="false"/>
                 <w:iCs w:val="false"/>
+                <w:strike w:val="false"/>
                 <w:color w:val="FFFFFF"/>
                 <w:sz w:val="19"/>
                 <w:szCs w:val="19"/>
@@ -2339,6 +2390,7 @@
                 <w:bCs/>
                 <w:i w:val="false"/>
                 <w:iCs w:val="false"/>
+                <w:strike w:val="false"/>
                 <w:color w:val="353744"/>
                 <w:sz w:val="20"/>
                 <w:szCs w:val="20"/>
@@ -2360,6 +2412,7 @@
           <w:p>
             <w:pPr>
               <w:spacing w:after="40" w:before="40"/>
+              <w:jc w:val="center"/>
             </w:pPr>
             <w:r>
               <w:rPr>
@@ -2368,6 +2421,7 @@
                 <w:bCs w:val="false"/>
                 <w:i w:val="false"/>
                 <w:iCs w:val="false"/>
+                <w:strike w:val="false"/>
                 <w:color w:val="188038"/>
                 <w:sz w:val="18"/>
                 <w:szCs w:val="18"/>
@@ -2398,6 +2452,7 @@
                 <w:bCs w:val="false"/>
                 <w:i w:val="false"/>
                 <w:iCs w:val="false"/>
+                <w:strike w:val="false"/>
                 <w:color w:val="353744"/>
                 <w:sz w:val="20"/>
                 <w:szCs w:val="20"/>
@@ -2411,6 +2466,7 @@
                 <w:bCs w:val="false"/>
                 <w:i/>
                 <w:iCs/>
+                <w:strike w:val="false"/>
                 <w:color w:val="353744"/>
                 <w:sz w:val="20"/>
                 <w:szCs w:val="20"/>
@@ -2424,6 +2480,7 @@
                 <w:bCs w:val="false"/>
                 <w:i w:val="false"/>
                 <w:iCs w:val="false"/>
+                <w:strike w:val="false"/>
                 <w:color w:val="353744"/>
                 <w:sz w:val="20"/>
                 <w:szCs w:val="20"/>
@@ -2455,6 +2512,7 @@
                 <w:bCs w:val="false"/>
                 <w:i w:val="false"/>
                 <w:iCs w:val="false"/>
+                <w:strike w:val="false"/>
                 <w:color w:val="353744"/>
                 <w:sz w:val="20"/>
                 <w:szCs w:val="20"/>
@@ -2476,6 +2534,7 @@
           <w:p>
             <w:pPr>
               <w:spacing w:after="40" w:before="40"/>
+              <w:jc w:val="center"/>
             </w:pPr>
             <w:r>
               <w:rPr>
@@ -2484,6 +2543,7 @@
                 <w:bCs w:val="false"/>
                 <w:i w:val="false"/>
                 <w:iCs w:val="false"/>
+                <w:strike w:val="false"/>
                 <w:color w:val="353744"/>
                 <w:sz w:val="20"/>
                 <w:szCs w:val="20"/>
@@ -2513,13 +2573,14 @@
                 <w:bCs w:val="false"/>
                 <w:i w:val="false"/>
                 <w:iCs w:val="false"/>
+                <w:strike w:val="false"/>
                 <w:color w:val="353744"/>
                 <w:sz w:val="20"/>
                 <w:szCs w:val="20"/>
               </w:rPr>
               <w:t xml:space="preserve">See </w:t>
             </w:r>
-            <w:hyperlink w:history="1" r:id="rIdyfmqkqpm3ydcvtkbsxxfg">
+            <w:hyperlink w:history="1" r:id="rIdf5z0b5bwlx_dvhuzjlqgl">
               <w:r>
                 <w:rPr>
                   <w:rFonts w:ascii="Roboto" w:cs="Roboto" w:eastAsia="Roboto" w:hAnsi="Roboto"/>
@@ -2527,6 +2588,7 @@
                   <w:bCs w:val="false"/>
                   <w:i w:val="false"/>
                   <w:iCs w:val="false"/>
+                  <w:strike w:val="false"/>
                   <w:color w:val="058775"/>
                   <w:sz w:val="20"/>
                   <w:szCs w:val="20"/>
@@ -2559,6 +2621,7 @@
                 <w:bCs w:val="false"/>
                 <w:i w:val="false"/>
                 <w:iCs w:val="false"/>
+                <w:strike w:val="false"/>
                 <w:color w:val="353744"/>
                 <w:sz w:val="20"/>
                 <w:szCs w:val="20"/>
@@ -2580,6 +2643,7 @@
           <w:p>
             <w:pPr>
               <w:spacing w:after="40" w:before="40"/>
+              <w:jc w:val="center"/>
             </w:pPr>
             <w:r>
               <w:rPr>
@@ -2588,6 +2652,7 @@
                 <w:bCs w:val="false"/>
                 <w:i w:val="false"/>
                 <w:iCs w:val="false"/>
+                <w:strike w:val="false"/>
                 <w:color w:val="353744"/>
                 <w:sz w:val="20"/>
                 <w:szCs w:val="20"/>
@@ -2617,6 +2682,7 @@
                 <w:bCs w:val="false"/>
                 <w:i w:val="false"/>
                 <w:iCs w:val="false"/>
+                <w:strike w:val="false"/>
                 <w:color w:val="353744"/>
                 <w:sz w:val="20"/>
                 <w:szCs w:val="20"/>
@@ -2630,6 +2696,7 @@
                 <w:bCs/>
                 <w:i w:val="false"/>
                 <w:iCs w:val="false"/>
+                <w:strike w:val="false"/>
                 <w:color w:val="353744"/>
                 <w:sz w:val="20"/>
                 <w:szCs w:val="20"/>
@@ -2643,6 +2710,7 @@
                 <w:bCs w:val="false"/>
                 <w:i w:val="false"/>
                 <w:iCs w:val="false"/>
+                <w:strike w:val="false"/>
                 <w:color w:val="353744"/>
                 <w:sz w:val="20"/>
                 <w:szCs w:val="20"/>
@@ -2656,6 +2724,7 @@
                 <w:bCs w:val="false"/>
                 <w:i/>
                 <w:iCs/>
+                <w:strike w:val="false"/>
                 <w:color w:val="353744"/>
                 <w:sz w:val="20"/>
                 <w:szCs w:val="20"/>
@@ -2669,6 +2738,7 @@
                 <w:bCs w:val="false"/>
                 <w:i w:val="false"/>
                 <w:iCs w:val="false"/>
+                <w:strike w:val="false"/>
                 <w:color w:val="353744"/>
                 <w:sz w:val="20"/>
                 <w:szCs w:val="20"/>
@@ -2682,6 +2752,7 @@
                 <w:bCs w:val="false"/>
                 <w:i w:val="false"/>
                 <w:iCs w:val="false"/>
+                <w:strike w:val="false"/>
                 <w:color w:val="188038"/>
                 <w:sz w:val="18"/>
                 <w:szCs w:val="18"/>
@@ -2726,6 +2797,7 @@
           <w:bCs/>
           <w:i w:val="false"/>
           <w:iCs w:val="false"/>
+          <w:strike w:val="false"/>
           <w:color w:val="353744"/>
           <w:sz w:val="26"/>
           <w:szCs w:val="26"/>
@@ -2758,6 +2830,7 @@
           <w:bCs/>
           <w:i w:val="false"/>
           <w:iCs w:val="false"/>
+          <w:strike w:val="false"/>
           <w:color w:val="058775"/>
           <w:sz w:val="24"/>
           <w:szCs w:val="24"/>
@@ -2781,6 +2854,7 @@
           <w:bCs w:val="false"/>
           <w:i w:val="false"/>
           <w:iCs w:val="false"/>
+          <w:strike w:val="false"/>
           <w:color w:val="353744"/>
           <w:sz w:val="20"/>
           <w:szCs w:val="20"/>
@@ -2804,6 +2878,7 @@
           <w:bCs w:val="false"/>
           <w:i w:val="false"/>
           <w:iCs w:val="false"/>
+          <w:strike w:val="false"/>
           <w:color w:val="353744"/>
           <w:sz w:val="20"/>
           <w:szCs w:val="20"/>
@@ -2817,6 +2892,7 @@
           <w:bCs/>
           <w:i w:val="false"/>
           <w:iCs w:val="false"/>
+          <w:strike w:val="false"/>
           <w:color w:val="353744"/>
           <w:sz w:val="20"/>
           <w:szCs w:val="20"/>
@@ -2840,6 +2916,7 @@
           <w:bCs w:val="false"/>
           <w:i w:val="false"/>
           <w:iCs w:val="false"/>
+          <w:strike w:val="false"/>
           <w:color w:val="353744"/>
           <w:sz w:val="20"/>
           <w:szCs w:val="20"/>
@@ -2853,6 +2930,7 @@
           <w:bCs w:val="false"/>
           <w:i w:val="false"/>
           <w:iCs w:val="false"/>
+          <w:strike w:val="false"/>
           <w:color w:val="188038"/>
           <w:sz w:val="18"/>
           <w:szCs w:val="18"/>
@@ -2877,6 +2955,7 @@
           <w:bCs w:val="false"/>
           <w:i w:val="false"/>
           <w:iCs w:val="false"/>
+          <w:strike w:val="false"/>
           <w:color w:val="353744"/>
           <w:sz w:val="20"/>
           <w:szCs w:val="20"/>
@@ -2900,6 +2979,7 @@
           <w:bCs w:val="false"/>
           <w:i w:val="false"/>
           <w:iCs w:val="false"/>
+          <w:strike w:val="false"/>
           <w:color w:val="353744"/>
           <w:sz w:val="20"/>
           <w:szCs w:val="20"/>
@@ -2923,6 +3003,7 @@
           <w:bCs w:val="false"/>
           <w:i w:val="false"/>
           <w:iCs w:val="false"/>
+          <w:strike w:val="false"/>
           <w:color w:val="353744"/>
           <w:sz w:val="20"/>
           <w:szCs w:val="20"/>
@@ -2946,6 +3027,7 @@
           <w:bCs w:val="false"/>
           <w:i w:val="false"/>
           <w:iCs w:val="false"/>
+          <w:strike w:val="false"/>
           <w:color w:val="353744"/>
           <w:sz w:val="20"/>
           <w:szCs w:val="20"/>
@@ -2978,6 +3060,7 @@
           <w:bCs/>
           <w:i w:val="false"/>
           <w:iCs w:val="false"/>
+          <w:strike w:val="false"/>
           <w:color w:val="058775"/>
           <w:sz w:val="24"/>
           <w:szCs w:val="24"/>
@@ -3001,6 +3084,7 @@
           <w:bCs w:val="false"/>
           <w:i w:val="false"/>
           <w:iCs w:val="false"/>
+          <w:strike w:val="false"/>
           <w:color w:val="353744"/>
           <w:sz w:val="20"/>
           <w:szCs w:val="20"/>
@@ -3024,6 +3108,7 @@
           <w:bCs w:val="false"/>
           <w:i w:val="false"/>
           <w:iCs w:val="false"/>
+          <w:strike w:val="false"/>
           <w:color w:val="353744"/>
           <w:sz w:val="20"/>
           <w:szCs w:val="20"/>
@@ -3037,6 +3122,7 @@
           <w:bCs w:val="false"/>
           <w:i/>
           <w:iCs/>
+          <w:strike w:val="false"/>
           <w:color w:val="353744"/>
           <w:sz w:val="20"/>
           <w:szCs w:val="20"/>
@@ -3060,6 +3146,7 @@
           <w:bCs w:val="false"/>
           <w:i w:val="false"/>
           <w:iCs w:val="false"/>
+          <w:strike w:val="false"/>
           <w:color w:val="353744"/>
           <w:sz w:val="20"/>
           <w:szCs w:val="20"/>
@@ -3083,6 +3170,7 @@
           <w:bCs w:val="false"/>
           <w:i w:val="false"/>
           <w:iCs w:val="false"/>
+          <w:strike w:val="false"/>
           <w:color w:val="353744"/>
           <w:sz w:val="20"/>
           <w:szCs w:val="20"/>
@@ -3106,6 +3194,7 @@
           <w:bCs w:val="false"/>
           <w:i w:val="false"/>
           <w:iCs w:val="false"/>
+          <w:strike w:val="false"/>
           <w:color w:val="353744"/>
           <w:sz w:val="20"/>
           <w:szCs w:val="20"/>
@@ -3129,6 +3218,7 @@
           <w:bCs w:val="false"/>
           <w:i w:val="false"/>
           <w:iCs w:val="false"/>
+          <w:strike w:val="false"/>
           <w:color w:val="353744"/>
           <w:sz w:val="20"/>
           <w:szCs w:val="20"/>
@@ -3152,6 +3242,7 @@
           <w:bCs w:val="false"/>
           <w:i w:val="false"/>
           <w:iCs w:val="false"/>
+          <w:strike w:val="false"/>
           <w:color w:val="353744"/>
           <w:sz w:val="20"/>
           <w:szCs w:val="20"/>
@@ -3184,6 +3275,7 @@
           <w:bCs/>
           <w:i w:val="false"/>
           <w:iCs w:val="false"/>
+          <w:strike w:val="false"/>
           <w:color w:val="058775"/>
           <w:sz w:val="24"/>
           <w:szCs w:val="24"/>
@@ -3207,6 +3299,7 @@
           <w:bCs w:val="false"/>
           <w:i w:val="false"/>
           <w:iCs w:val="false"/>
+          <w:strike w:val="false"/>
           <w:color w:val="353744"/>
           <w:sz w:val="20"/>
           <w:szCs w:val="20"/>
@@ -3230,6 +3323,7 @@
           <w:bCs w:val="false"/>
           <w:i w:val="false"/>
           <w:iCs w:val="false"/>
+          <w:strike w:val="false"/>
           <w:color w:val="353744"/>
           <w:sz w:val="20"/>
           <w:szCs w:val="20"/>
@@ -3253,6 +3347,7 @@
           <w:bCs w:val="false"/>
           <w:i w:val="false"/>
           <w:iCs w:val="false"/>
+          <w:strike w:val="false"/>
           <w:color w:val="353744"/>
           <w:sz w:val="20"/>
           <w:szCs w:val="20"/>
@@ -3276,6 +3371,7 @@
           <w:bCs w:val="false"/>
           <w:i w:val="false"/>
           <w:iCs w:val="false"/>
+          <w:strike w:val="false"/>
           <w:color w:val="353744"/>
           <w:sz w:val="20"/>
           <w:szCs w:val="20"/>
@@ -3299,6 +3395,7 @@
           <w:bCs w:val="false"/>
           <w:i w:val="false"/>
           <w:iCs w:val="false"/>
+          <w:strike w:val="false"/>
           <w:color w:val="353744"/>
           <w:sz w:val="20"/>
           <w:szCs w:val="20"/>
@@ -3322,6 +3419,7 @@
           <w:bCs w:val="false"/>
           <w:i w:val="false"/>
           <w:iCs w:val="false"/>
+          <w:strike w:val="false"/>
           <w:color w:val="353744"/>
           <w:sz w:val="20"/>
           <w:szCs w:val="20"/>
@@ -3357,6 +3455,7 @@
           <w:bCs/>
           <w:i w:val="false"/>
           <w:iCs w:val="false"/>
+          <w:strike w:val="false"/>
           <w:color w:val="353744"/>
           <w:sz w:val="26"/>
           <w:szCs w:val="26"/>
@@ -3380,6 +3479,7 @@
           <w:bCs w:val="false"/>
           <w:i/>
           <w:iCs/>
+          <w:strike w:val="false"/>
           <w:color w:val="666666"/>
           <w:sz w:val="20"/>
           <w:szCs w:val="20"/>
@@ -3403,12 +3503,93 @@
           <w:bCs w:val="false"/>
           <w:i/>
           <w:iCs/>
+          <w:strike w:val="false"/>
           <w:color w:val="666666"/>
           <w:sz w:val="20"/>
           <w:szCs w:val="20"/>
         </w:rPr>
         <w:t xml:space="preserve">Multi-line blockquote that spans more than one line to verify that longer
 content wraps properly and maintains consistent styling throughout.</w:t>
+      </w:r>
+    </w:p>
+    <w:p>
+      <w:pPr>
+        <w:pBdr>
+          <w:left w:val="single" w:color="058775" w:sz="8"/>
+        </w:pBdr>
+        <w:shd w:fill="F9F9F9" w:val="clear"/>
+        <w:spacing w:after="120" w:line="360"/>
+        <w:ind w:left="283"/>
+      </w:pPr>
+      <w:r>
+        <w:rPr>
+          <w:rFonts w:ascii="Roboto" w:cs="Roboto" w:eastAsia="Roboto" w:hAnsi="Roboto"/>
+          <w:b/>
+          <w:bCs/>
+          <w:i/>
+          <w:iCs/>
+          <w:strike w:val="false"/>
+          <w:color w:val="666666"/>
+          <w:sz w:val="20"/>
+          <w:szCs w:val="20"/>
+        </w:rPr>
+        <w:t xml:space="preserve">Sources:</w:t>
+      </w:r>
+    </w:p>
+    <w:p>
+      <w:pPr>
+        <w:pStyle w:val="ListParagraph"/>
+        <w:numPr>
+          <w:ilvl w:val="0"/>
+          <w:numId w:val="2"/>
+        </w:numPr>
+        <w:pBdr>
+          <w:left w:val="single" w:color="058775" w:sz="8"/>
+        </w:pBdr>
+        <w:shd w:fill="F9F9F9" w:val="clear"/>
+        <w:spacing w:after="40" w:line="360"/>
+      </w:pPr>
+      <w:r>
+        <w:rPr>
+          <w:rFonts w:ascii="Roboto" w:cs="Roboto" w:eastAsia="Roboto" w:hAnsi="Roboto"/>
+          <w:b w:val="false"/>
+          <w:bCs w:val="false"/>
+          <w:i/>
+          <w:iCs/>
+          <w:strike w:val="false"/>
+          <w:color w:val="666666"/>
+          <w:sz w:val="20"/>
+          <w:szCs w:val="20"/>
+        </w:rPr>
+        <w:t xml:space="preserve">Quoted list item one</w:t>
+      </w:r>
+    </w:p>
+    <w:p>
+      <w:pPr>
+        <w:pStyle w:val="ListParagraph"/>
+        <w:numPr>
+          <w:ilvl w:val="0"/>
+          <w:numId w:val="2"/>
+        </w:numPr>
+        <w:pBdr>
+          <w:left w:val="single" w:color="058775" w:sz="8"/>
+        </w:pBdr>
+        <w:shd w:fill="F9F9F9" w:val="clear"/>
+        <w:spacing w:after="40" w:line="360"/>
+      </w:pPr>
+      <w:r>
+        <w:rPr>
+          <w:rFonts w:ascii="Roboto" w:cs="Roboto" w:eastAsia="Roboto" w:hAnsi="Roboto"/>
+          <w:b w:val="false"/>
+          <w:bCs w:val="false"/>
+          <w:i/>
+          <w:iCs/>
+          <w:strike w:val="false"/>
+          <w:color w:val="666666"/>
+          <w:sz w:val="20"/>
+          <w:szCs w:val="20"/>
+        </w:rPr>
+        <w:t xml:space="preserve">Quoted list item two</w:t>
       </w:r>
     </w:p>
     <w:p>
@@ -3439,6 +3620,7 @@
           <w:bCs/>
           <w:i w:val="false"/>
           <w:iCs w:val="false"/>
+          <w:strike w:val="false"/>
           <w:color w:val="353744"/>
           <w:sz w:val="26"/>
           <w:szCs w:val="26"/>
@@ -3457,6 +3639,7 @@
           <w:bCs w:val="false"/>
           <w:i w:val="false"/>
           <w:iCs w:val="false"/>
+          <w:strike w:val="false"/>
           <w:color w:val="353744"/>
           <w:sz w:val="20"/>
           <w:szCs w:val="20"/>
@@ -3520,6 +3703,7 @@
           <w:bCs w:val="false"/>
           <w:i w:val="false"/>
           <w:iCs w:val="false"/>
+          <w:strike w:val="false"/>
           <w:color w:val="353744"/>
           <w:sz w:val="20"/>
           <w:szCs w:val="20"/>
@@ -3600,6 +3784,7 @@
           <w:bCs/>
           <w:i w:val="false"/>
           <w:iCs w:val="false"/>
+          <w:strike w:val="false"/>
           <w:color w:val="353744"/>
           <w:sz w:val="26"/>
           <w:szCs w:val="26"/>
@@ -3632,6 +3817,7 @@
           <w:bCs/>
           <w:i w:val="false"/>
           <w:iCs w:val="false"/>
+          <w:strike w:val="false"/>
           <w:color w:val="058775"/>
           <w:sz w:val="24"/>
           <w:szCs w:val="24"/>
@@ -3710,6 +3896,7 @@
           <w:bCs/>
           <w:i w:val="false"/>
           <w:iCs w:val="false"/>
+          <w:strike w:val="false"/>
           <w:color w:val="058775"/>
           <w:sz w:val="24"/>
           <w:szCs w:val="24"/>
@@ -3788,6 +3975,7 @@
           <w:bCs/>
           <w:i w:val="false"/>
           <w:iCs w:val="false"/>
+          <w:strike w:val="false"/>
           <w:color w:val="058775"/>
           <w:sz w:val="24"/>
           <w:szCs w:val="24"/>
@@ -3869,6 +4057,7 @@
           <w:bCs/>
           <w:i w:val="false"/>
           <w:iCs w:val="false"/>
+          <w:strike w:val="false"/>
           <w:color w:val="353744"/>
           <w:sz w:val="26"/>
           <w:szCs w:val="26"/>
@@ -3887,6 +4076,7 @@
           <w:bCs w:val="false"/>
           <w:i w:val="false"/>
           <w:iCs w:val="false"/>
+          <w:strike w:val="false"/>
           <w:color w:val="353744"/>
           <w:sz w:val="20"/>
           <w:szCs w:val="20"/>
@@ -3913,6 +4103,7 @@
           <w:bCs w:val="false"/>
           <w:i w:val="false"/>
           <w:iCs w:val="false"/>
+          <w:strike w:val="false"/>
           <w:color w:val="353744"/>
           <w:sz w:val="20"/>
           <w:szCs w:val="20"/>
@@ -3948,6 +4139,7 @@
           <w:bCs/>
           <w:i w:val="false"/>
           <w:iCs w:val="false"/>
+          <w:strike w:val="false"/>
           <w:color w:val="353744"/>
           <w:sz w:val="26"/>
           <w:szCs w:val="26"/>
@@ -3980,6 +4172,7 @@
           <w:bCs/>
           <w:i w:val="false"/>
           <w:iCs w:val="false"/>
+          <w:strike w:val="false"/>
           <w:color w:val="058775"/>
           <w:sz w:val="24"/>
           <w:szCs w:val="24"/>
@@ -3998,6 +4191,7 @@
           <w:bCs w:val="false"/>
           <w:i w:val="false"/>
           <w:iCs w:val="false"/>
+          <w:strike w:val="false"/>
           <w:color w:val="353744"/>
           <w:sz w:val="20"/>
           <w:szCs w:val="20"/>
@@ -4030,6 +4224,7 @@
           <w:bCs/>
           <w:i w:val="false"/>
           <w:iCs w:val="false"/>
+          <w:strike w:val="false"/>
           <w:color w:val="272727"/>
           <w:sz w:val="22"/>
           <w:szCs w:val="22"/>
@@ -4048,6 +4243,7 @@
           <w:bCs w:val="false"/>
           <w:i w:val="false"/>
           <w:iCs w:val="false"/>
+          <w:strike w:val="false"/>
           <w:color w:val="353744"/>
           <w:sz w:val="20"/>
           <w:szCs w:val="20"/>
@@ -4080,6 +4276,7 @@
           <w:bCs/>
           <w:i w:val="false"/>
           <w:iCs w:val="false"/>
+          <w:strike w:val="false"/>
           <w:color w:val="058775"/>
           <w:sz w:val="24"/>
           <w:szCs w:val="24"/>
@@ -4098,6 +4295,7 @@
           <w:bCs w:val="false"/>
           <w:i w:val="false"/>
           <w:iCs w:val="false"/>
+          <w:strike w:val="false"/>
           <w:color w:val="353744"/>
           <w:sz w:val="20"/>
           <w:szCs w:val="20"/>
@@ -4133,6 +4331,7 @@
           <w:bCs/>
           <w:i w:val="false"/>
           <w:iCs w:val="false"/>
+          <w:strike w:val="false"/>
           <w:color w:val="353744"/>
           <w:sz w:val="26"/>
           <w:szCs w:val="26"/>
@@ -4165,6 +4364,7 @@
           <w:bCs/>
           <w:i w:val="false"/>
           <w:iCs w:val="false"/>
+          <w:strike w:val="false"/>
           <w:color w:val="058775"/>
           <w:sz w:val="24"/>
           <w:szCs w:val="24"/>
@@ -4214,6 +4414,7 @@
                 <w:bCs/>
                 <w:i w:val="false"/>
                 <w:iCs w:val="false"/>
+                <w:strike w:val="false"/>
                 <w:color w:val="FFFFFF"/>
                 <w:sz w:val="19"/>
                 <w:szCs w:val="19"/>
@@ -4243,6 +4444,7 @@
                 <w:bCs/>
                 <w:i w:val="false"/>
                 <w:iCs w:val="false"/>
+                <w:strike w:val="false"/>
                 <w:color w:val="FFFFFF"/>
                 <w:sz w:val="19"/>
                 <w:szCs w:val="19"/>
@@ -4272,6 +4474,7 @@
                 <w:bCs/>
                 <w:i w:val="false"/>
                 <w:iCs w:val="false"/>
+                <w:strike w:val="false"/>
                 <w:color w:val="FFFFFF"/>
                 <w:sz w:val="19"/>
                 <w:szCs w:val="19"/>
@@ -4303,6 +4506,7 @@
                 <w:bCs w:val="false"/>
                 <w:i w:val="false"/>
                 <w:iCs w:val="false"/>
+                <w:strike w:val="false"/>
                 <w:color w:val="353744"/>
                 <w:sz w:val="20"/>
                 <w:szCs w:val="20"/>
@@ -4382,6 +4586,7 @@
                 <w:bCs w:val="false"/>
                 <w:i w:val="false"/>
                 <w:iCs w:val="false"/>
+                <w:strike w:val="false"/>
                 <w:color w:val="353744"/>
                 <w:sz w:val="20"/>
                 <w:szCs w:val="20"/>
@@ -4438,6 +4643,7 @@
           <w:bCs/>
           <w:i w:val="false"/>
           <w:iCs w:val="false"/>
+          <w:strike w:val="false"/>
           <w:color w:val="058775"/>
           <w:sz w:val="24"/>
           <w:szCs w:val="24"/>
@@ -4456,6 +4662,7 @@
           <w:bCs w:val="false"/>
           <w:i w:val="false"/>
           <w:iCs w:val="false"/>
+          <w:strike w:val="false"/>
           <w:color w:val="353744"/>
           <w:sz w:val="20"/>
           <w:szCs w:val="20"/>
@@ -4469,6 +4676,7 @@
           <w:bCs w:val="false"/>
           <w:i w:val="false"/>
           <w:iCs w:val="false"/>
+          <w:strike w:val="false"/>
           <w:color w:val="188038"/>
           <w:sz w:val="18"/>
           <w:szCs w:val="18"/>
@@ -4483,6 +4691,7 @@
           <w:bCs w:val="false"/>
           <w:i w:val="false"/>
           <w:iCs w:val="false"/>
+          <w:strike w:val="false"/>
           <w:color w:val="353744"/>
           <w:sz w:val="20"/>
           <w:szCs w:val="20"/>
@@ -4515,6 +4724,7 @@
           <w:bCs/>
           <w:i w:val="false"/>
           <w:iCs w:val="false"/>
+          <w:strike w:val="false"/>
           <w:color w:val="058775"/>
           <w:sz w:val="24"/>
           <w:szCs w:val="24"/>
@@ -4533,6 +4743,7 @@
           <w:bCs w:val="false"/>
           <w:i w:val="false"/>
           <w:iCs w:val="false"/>
+          <w:strike w:val="false"/>
           <w:color w:val="353744"/>
           <w:sz w:val="20"/>
           <w:szCs w:val="20"/>
@@ -4556,6 +4767,7 @@
           <w:bCs w:val="false"/>
           <w:i w:val="false"/>
           <w:iCs w:val="false"/>
+          <w:strike w:val="false"/>
           <w:color w:val="353744"/>
           <w:sz w:val="20"/>
           <w:szCs w:val="20"/>
@@ -4579,6 +4791,7 @@
           <w:bCs w:val="false"/>
           <w:i w:val="false"/>
           <w:iCs w:val="false"/>
+          <w:strike w:val="false"/>
           <w:color w:val="353744"/>
           <w:sz w:val="20"/>
           <w:szCs w:val="20"/>
@@ -4597,6 +4810,7 @@
           <w:bCs w:val="false"/>
           <w:i w:val="false"/>
           <w:iCs w:val="false"/>
+          <w:strike w:val="false"/>
           <w:color w:val="353744"/>
           <w:sz w:val="20"/>
           <w:szCs w:val="20"/>
@@ -4620,6 +4834,7 @@
           <w:bCs w:val="false"/>
           <w:i w:val="false"/>
           <w:iCs w:val="false"/>
+          <w:strike w:val="false"/>
           <w:color w:val="353744"/>
           <w:sz w:val="20"/>
           <w:szCs w:val="20"/>
@@ -4643,6 +4858,7 @@
           <w:bCs w:val="false"/>
           <w:i w:val="false"/>
           <w:iCs w:val="false"/>
+          <w:strike w:val="false"/>
           <w:color w:val="353744"/>
           <w:sz w:val="20"/>
           <w:szCs w:val="20"/>
@@ -4675,6 +4891,7 @@
           <w:bCs/>
           <w:i w:val="false"/>
           <w:iCs w:val="false"/>
+          <w:strike w:val="false"/>
           <w:color w:val="058775"/>
           <w:sz w:val="24"/>
           <w:szCs w:val="24"/>
@@ -4693,6 +4910,7 @@
           <w:bCs w:val="false"/>
           <w:i w:val="false"/>
           <w:iCs w:val="false"/>
+          <w:strike w:val="false"/>
           <w:color w:val="353744"/>
           <w:sz w:val="20"/>
           <w:szCs w:val="20"/>
@@ -4728,6 +4946,7 @@
           <w:bCs/>
           <w:i w:val="false"/>
           <w:iCs w:val="false"/>
+          <w:strike w:val="false"/>
           <w:color w:val="353744"/>
           <w:sz w:val="26"/>
           <w:szCs w:val="26"/>
@@ -4746,6 +4965,7 @@
           <w:bCs w:val="false"/>
           <w:i w:val="false"/>
           <w:iCs w:val="false"/>
+          <w:strike w:val="false"/>
           <w:color w:val="353744"/>
           <w:sz w:val="20"/>
           <w:szCs w:val="20"/>
@@ -4769,6 +4989,7 @@
           <w:bCs w:val="false"/>
           <w:i w:val="false"/>
           <w:iCs w:val="false"/>
+          <w:strike w:val="false"/>
           <w:color w:val="353744"/>
           <w:sz w:val="20"/>
           <w:szCs w:val="20"/>
@@ -4792,6 +5013,7 @@
           <w:bCs w:val="false"/>
           <w:i w:val="false"/>
           <w:iCs w:val="false"/>
+          <w:strike w:val="false"/>
           <w:color w:val="353744"/>
           <w:sz w:val="20"/>
           <w:szCs w:val="20"/>
@@ -4815,6 +5037,7 @@
           <w:bCs w:val="false"/>
           <w:i w:val="false"/>
           <w:iCs w:val="false"/>
+          <w:strike w:val="false"/>
           <w:color w:val="353744"/>
           <w:sz w:val="20"/>
           <w:szCs w:val="20"/>
@@ -4838,6 +5061,7 @@
           <w:bCs w:val="false"/>
           <w:i w:val="false"/>
           <w:iCs w:val="false"/>
+          <w:strike w:val="false"/>
           <w:color w:val="353744"/>
           <w:sz w:val="20"/>
           <w:szCs w:val="20"/>
@@ -4861,6 +5085,7 @@
           <w:bCs w:val="false"/>
           <w:i w:val="false"/>
           <w:iCs w:val="false"/>
+          <w:strike w:val="false"/>
           <w:color w:val="353744"/>
           <w:sz w:val="20"/>
           <w:szCs w:val="20"/>
@@ -4884,6 +5109,7 @@
           <w:bCs w:val="false"/>
           <w:i w:val="false"/>
           <w:iCs w:val="false"/>
+          <w:strike w:val="false"/>
           <w:color w:val="353744"/>
           <w:sz w:val="20"/>
           <w:szCs w:val="20"/>
@@ -4907,6 +5133,7 @@
           <w:bCs w:val="false"/>
           <w:i w:val="false"/>
           <w:iCs w:val="false"/>
+          <w:strike w:val="false"/>
           <w:color w:val="353744"/>
           <w:sz w:val="20"/>
           <w:szCs w:val="20"/>
@@ -4930,6 +5157,7 @@
           <w:bCs w:val="false"/>
           <w:i w:val="false"/>
           <w:iCs w:val="false"/>
+          <w:strike w:val="false"/>
           <w:color w:val="353744"/>
           <w:sz w:val="20"/>
           <w:szCs w:val="20"/>
@@ -4953,6 +5181,7 @@
           <w:bCs w:val="false"/>
           <w:i w:val="false"/>
           <w:iCs w:val="false"/>
+          <w:strike w:val="false"/>
           <w:color w:val="353744"/>
           <w:sz w:val="20"/>
           <w:szCs w:val="20"/>
@@ -4976,6 +5205,7 @@
           <w:bCs w:val="false"/>
           <w:i w:val="false"/>
           <w:iCs w:val="false"/>
+          <w:strike w:val="false"/>
           <w:color w:val="353744"/>
           <w:sz w:val="20"/>
           <w:szCs w:val="20"/>
@@ -4999,6 +5229,7 @@
           <w:bCs w:val="false"/>
           <w:i w:val="false"/>
           <w:iCs w:val="false"/>
+          <w:strike w:val="false"/>
           <w:color w:val="353744"/>
           <w:sz w:val="20"/>
           <w:szCs w:val="20"/>
@@ -5022,6 +5253,7 @@
           <w:bCs w:val="false"/>
           <w:i w:val="false"/>
           <w:iCs w:val="false"/>
+          <w:strike w:val="false"/>
           <w:color w:val="353744"/>
           <w:sz w:val="20"/>
           <w:szCs w:val="20"/>

</xml_diff>